<commit_message>
update: shleeclay 온라인 강의 수강생 1,100+ 돌파 반영 (about.stats·CV 콤마표기 통일)
</commit_message>
<xml_diff>
--- a/cv/Lee_Seunghyeon_CV_v11.docx
+++ b/cv/Lee_Seunghyeon_CV_v11.docx
@@ -7592,7 +7592,7 @@
           <w:color w:val="6F6F6F"/>
           <w:sz w:val="18"/>
         </w:rPr>
-        <w:t>2 university courses · 4 online courses (1,000+ students) · 20+ invited lectures and workshops.</w:t>
+        <w:t>2 university courses · 4 online courses (1,100+ students) · 20+ invited lectures and workshops.</w:t>
       </w:r>
     </w:p>
     <w:p>
@@ -7707,7 +7707,7 @@
           <w:color w:val="1F4E3D"/>
           <w:sz w:val="21"/>
         </w:rPr>
-        <w:t>Online Courses  (1,000+ students enrolled)</w:t>
+        <w:t>Online Courses  (1,100+ students enrolled)</w:t>
       </w:r>
     </w:p>
     <w:p>
@@ -8598,7 +8598,7 @@
           <w:sz w:val="20"/>
         </w:rPr>
         <w:tab/>
-        <w:t>Date: 17 August 2026</w:t>
+        <w:t>Date: 20 August 2026</w:t>
       </w:r>
     </w:p>
     <w:sectPr>

</xml_diff>

<commit_message>
update: shleeclay CV 헤더 'Clay Lee' 제거 + 박사 기간 형식 통일(YYYY.MM, expected 표기) — v11 재생성·배포 PDF 교체
- build_cv.py: 헤더 (Clay Lee) 런 삭제, _edu_period 를 항상 Start-End(YYYY.MM) 그대로 + 수여예정 '(expected)'
- 로직 변경 전 pys_old/260906_build_cv.py 백업, 기준선 갱신

Co-Authored-By: Claude Fable 5.1 <noreply@anthropic.com>
Claude-Session: https://claude.ai/code/session_01F86s2FRpdMeQ8RSwygs9Zn
</commit_message>
<xml_diff>
--- a/cv/Lee_Seunghyeon_CV_v11.docx
+++ b/cv/Lee_Seunghyeon_CV_v11.docx
@@ -16,16 +16,6 @@
           <w:sz w:val="48"/>
         </w:rPr>
         <w:t>Seunghyeon Lee</w:t>
-      </w:r>
-      <w:r>
-        <w:rPr>
-          <w:rFonts w:ascii="Cambria" w:hAnsi="Cambria" w:cs="Cambria" w:eastAsia="Cambria"/>
-          <w:b w:val="0"/>
-          <w:i w:val="0"/>
-          <w:color w:val="444444"/>
-          <w:sz w:val="24"/>
-        </w:rPr>
-        <w:t xml:space="preserve">  (Clay Lee)</w:t>
       </w:r>
       <w:r>
         <w:rPr>
@@ -249,7 +239,7 @@
           <w:sz w:val="20"/>
         </w:rPr>
         <w:tab/>
-        <w:t>2022.03 — Aug 2026</w:t>
+        <w:t>2022.03 — 2026.08 (expected)</w:t>
       </w:r>
     </w:p>
     <w:p>
@@ -8598,7 +8588,7 @@
           <w:sz w:val="20"/>
         </w:rPr>
         <w:tab/>
-        <w:t>Date: 20 August 2026</w:t>
+        <w:t>Date: 06 September 2026</w:t>
       </w:r>
     </w:p>
     <w:sectPr>

</xml_diff>

<commit_message>
update: shleeclay CV 서명 제거 — 공개 CV 는 'Last updated: Mon YYYY' 한 줄, 서명 PNG 저장소에서 삭제·gitignore
- 영문 학술 CV 관행 아님(cv/refs 4편 모두 서명 없음) + 서명 이미지는 신원 자격증명이라 공개 노출 위험
- build_cv.py: 서명본은 CV_SIGNED=1 + 비공개 %USERPROFILE%/.config/shleeclay/signature.png 에서만 (커밋 금지)
- git rm cv/assets/signature.png, cv/old/signature_original_2021.png (원본은 비공개 경로에 보관), gitignore 4규칙
- _cv_baseline: 'Last updated' 월 마스킹 추가, pys_old/260906_build_cv_pre_sig.py 백업

Co-Authored-By: Claude Fable 5.1 <noreply@anthropic.com>
Claude-Session: https://claude.ai/code/session_01F86s2FRpdMeQ8RSwygs9Zn
</commit_message>
<xml_diff>
--- a/cv/Lee_Seunghyeon_CV_v11.docx
+++ b/cv/Lee_Seunghyeon_CV_v11.docx
@@ -8525,70 +8525,18 @@
     </w:p>
     <w:p>
       <w:pPr>
-        <w:spacing w:before="320"/>
+        <w:spacing w:before="360"/>
+        <w:jc w:val="right"/>
       </w:pPr>
       <w:r>
-        <w:drawing>
-          <wp:inline xmlns:a="http://schemas.openxmlformats.org/drawingml/2006/main" xmlns:pic="http://schemas.openxmlformats.org/drawingml/2006/picture">
-            <wp:extent cx="624582" cy="548640"/>
-            <wp:docPr id="1" name="Picture 1"/>
-            <wp:cNvGraphicFramePr>
-              <a:graphicFrameLocks noChangeAspect="1"/>
-            </wp:cNvGraphicFramePr>
-            <a:graphic>
-              <a:graphicData uri="http://schemas.openxmlformats.org/drawingml/2006/picture">
-                <pic:pic>
-                  <pic:nvPicPr>
-                    <pic:cNvPr id="0" name="signature.png"/>
-                    <pic:cNvPicPr/>
-                  </pic:nvPicPr>
-                  <pic:blipFill>
-                    <a:blip r:embed="rId29"/>
-                    <a:stretch>
-                      <a:fillRect/>
-                    </a:stretch>
-                  </pic:blipFill>
-                  <pic:spPr>
-                    <a:xfrm>
-                      <a:off x="0" y="0"/>
-                      <a:ext cx="624582" cy="548640"/>
-                    </a:xfrm>
-                    <a:prstGeom prst="rect"/>
-                  </pic:spPr>
-                </pic:pic>
-              </a:graphicData>
-            </a:graphic>
-          </wp:inline>
-        </w:drawing>
-      </w:r>
-    </w:p>
-    <w:p>
-      <w:pPr>
-        <w:tabs>
-          <w:tab w:pos="10224" w:val="right"/>
-        </w:tabs>
-        <w:spacing w:before="20"/>
-      </w:pPr>
-      <w:r>
-        <w:rPr>
-          <w:rFonts w:ascii="Cambria" w:hAnsi="Cambria" w:cs="Cambria" w:eastAsia="Cambria"/>
-          <w:b/>
-          <w:i w:val="0"/>
-          <w:color w:val="1A1A1A"/>
-          <w:sz w:val="21"/>
-        </w:rPr>
-        <w:t>Seunghyeon Lee</w:t>
-      </w:r>
-      <w:r>
-        <w:rPr>
-          <w:rFonts w:ascii="Cambria" w:hAnsi="Cambria" w:cs="Cambria" w:eastAsia="Cambria"/>
-          <w:b w:val="0"/>
-          <w:i w:val="0"/>
-          <w:color w:val="444444"/>
-          <w:sz w:val="20"/>
-        </w:rPr>
-        <w:tab/>
-        <w:t>Date: 06 September 2026</w:t>
+        <w:rPr>
+          <w:rFonts w:ascii="Cambria" w:hAnsi="Cambria" w:cs="Cambria" w:eastAsia="Cambria"/>
+          <w:b w:val="0"/>
+          <w:i/>
+          <w:color w:val="6F6F6F"/>
+          <w:sz w:val="18"/>
+        </w:rPr>
+        <w:t>Last updated: Sep 2026</w:t>
       </w:r>
     </w:p>
     <w:sectPr>

</xml_diff>